<commit_message>
docs: add official Pull Request #7 link and screenshot to report
</commit_message>
<xml_diff>
--- a/Lab08_Akishev_IS-2406_final.docx
+++ b/Lab08_Akishev_IS-2406_final.docx
@@ -284,6 +284,43 @@
                 <w:sz w:val="19"/>
               </w:rPr>
               <w:t>https://github.com/adilkhanakishev/spring-lab-01/tree/lab08</w:t>
+            </w:r>
+          </w:p>
+        </w:tc>
+      </w:tr>
+      <w:tr>
+        <w:tc>
+          <w:tcPr>
+            <w:tcW w:type="dxa" w:w="3168"/>
+            <w:shd w:val="clear" w:color="auto" w:fill="F8FAFC"/>
+          </w:tcPr>
+          <w:p>
+            <w:pPr>
+              <w:spacing w:before="60" w:after="60"/>
+            </w:pPr>
+            <w:r>
+              <w:rPr>
+                <w:b/>
+                <w:sz w:val="19"/>
+              </w:rPr>
+              <w:t>Official Pull Request</w:t>
+            </w:r>
+          </w:p>
+        </w:tc>
+        <w:tc>
+          <w:tcPr>
+            <w:tcW w:type="dxa" w:w="6912"/>
+            <w:shd w:val="clear" w:color="auto" w:fill="FFFFFF"/>
+          </w:tcPr>
+          <w:p>
+            <w:pPr>
+              <w:spacing w:before="60" w:after="60"/>
+            </w:pPr>
+            <w:r>
+              <w:rPr>
+                <w:sz w:val="19"/>
+              </w:rPr>
+              <w:t>https://github.com/adilkhanakishev/spring-lab-01/pull/7</w:t>
             </w:r>
           </w:p>
         </w:tc>
@@ -1603,7 +1640,7 @@
           <w:color w:val="0F172A"/>
           <w:sz w:val="26"/>
         </w:rPr>
-        <w:t>10. Testing and Interactive API Documentation</w:t>
+        <w:t>10. Testing, Interactive API Documentation, and Pull Request</w:t>
       </w:r>
     </w:p>
     <w:p>
@@ -1722,6 +1759,65 @@
           <w:sz w:val="18"/>
         </w:rPr>
         <w:t>Figure 9. Interactive OpenAPI 3.1 Swagger UI documentation</w:t>
+      </w:r>
+    </w:p>
+    <w:p>
+      <w:r>
+        <w:t>Official GitHub Pull Request #7 (lab08 -&gt; main):</w:t>
+      </w:r>
+    </w:p>
+    <w:p>
+      <w:pPr>
+        <w:spacing w:before="120" w:after="40"/>
+        <w:jc w:val="center"/>
+      </w:pPr>
+      <w:r>
+        <w:drawing>
+          <wp:inline xmlns:a="http://schemas.openxmlformats.org/drawingml/2006/main" xmlns:pic="http://schemas.openxmlformats.org/drawingml/2006/picture">
+            <wp:extent cx="5669280" cy="2973050"/>
+            <wp:docPr id="10" name="Picture 10"/>
+            <wp:cNvGraphicFramePr>
+              <a:graphicFrameLocks noChangeAspect="1"/>
+            </wp:cNvGraphicFramePr>
+            <a:graphic>
+              <a:graphicData uri="http://schemas.openxmlformats.org/drawingml/2006/picture">
+                <pic:pic>
+                  <pic:nvPicPr>
+                    <pic:cNvPr id="0" name="fig10_github_pr.png"/>
+                    <pic:cNvPicPr/>
+                  </pic:nvPicPr>
+                  <pic:blipFill>
+                    <a:blip r:embed="rId18"/>
+                    <a:stretch>
+                      <a:fillRect/>
+                    </a:stretch>
+                  </pic:blipFill>
+                  <pic:spPr>
+                    <a:xfrm>
+                      <a:off x="0" y="0"/>
+                      <a:ext cx="5669280" cy="2973050"/>
+                    </a:xfrm>
+                    <a:prstGeom prst="rect"/>
+                  </pic:spPr>
+                </pic:pic>
+              </a:graphicData>
+            </a:graphic>
+          </wp:inline>
+        </w:drawing>
+      </w:r>
+    </w:p>
+    <w:p>
+      <w:pPr>
+        <w:spacing w:after="160"/>
+        <w:jc w:val="center"/>
+      </w:pPr>
+      <w:r>
+        <w:rPr>
+          <w:i/>
+          <w:color w:val="64748B"/>
+          <w:sz w:val="18"/>
+        </w:rPr>
+        <w:t>Figure 10. Official GitHub Pull Request #7 submitted on repository</w:t>
       </w:r>
     </w:p>
     <w:p>

</xml_diff>